<commit_message>
feat: actualizar plantillas de cartas oficiales y logica de autoservicio
</commit_message>
<xml_diff>
--- a/documentos/cartas/plantillas/carta_ampliacion.docx
+++ b/documentos/cartas/plantillas/carta_ampliacion.docx
@@ -1,6 +1,6 @@
 
 <file path=word/document.xml><?xml version="1.0" encoding="utf-8"?>
-<w:document xmlns:a="http://schemas.openxmlformats.org/drawingml/2006/main" xmlns:mc="http://schemas.openxmlformats.org/markup-compatibility/2006" xmlns:ns4="http://schemas.microsoft.com/office/word/2010/wordprocessingDrawing" xmlns:ns8="http://schemas.microsoft.com/office/drawing/2016/SVG/main" xmlns:pic="http://schemas.openxmlformats.org/drawingml/2006/picture" xmlns:r="http://schemas.openxmlformats.org/officeDocument/2006/relationships" xmlns:w="http://schemas.openxmlformats.org/wordprocessingml/2006/main" xmlns:w14="http://schemas.microsoft.com/office/word/2010/wordml" xmlns:wp="http://schemas.openxmlformats.org/drawingml/2006/wordprocessingDrawing" mc:Ignorable="w14 w15 w16se w16cid w16 w16cex w16sdtdh w16sdtfl w16du wp14">
+<w:document xmlns:wpc="http://schemas.microsoft.com/office/word/2010/wordprocessingCanvas" xmlns:cx="http://schemas.microsoft.com/office/drawing/2014/chartex" xmlns:cx1="http://schemas.microsoft.com/office/drawing/2015/9/8/chartex" xmlns:cx2="http://schemas.microsoft.com/office/drawing/2015/10/21/chartex" xmlns:cx3="http://schemas.microsoft.com/office/drawing/2016/5/9/chartex" xmlns:cx4="http://schemas.microsoft.com/office/drawing/2016/5/10/chartex" xmlns:cx5="http://schemas.microsoft.com/office/drawing/2016/5/11/chartex" xmlns:cx6="http://schemas.microsoft.com/office/drawing/2016/5/12/chartex" xmlns:cx7="http://schemas.microsoft.com/office/drawing/2016/5/13/chartex" xmlns:cx8="http://schemas.microsoft.com/office/drawing/2016/5/14/chartex" xmlns:mc="http://schemas.openxmlformats.org/markup-compatibility/2006" xmlns:aink="http://schemas.microsoft.com/office/drawing/2016/ink" xmlns:am3d="http://schemas.microsoft.com/office/drawing/2017/model3d" xmlns:o="urn:schemas-microsoft-com:office:office" xmlns:oel="http://schemas.microsoft.com/office/2019/extlst" xmlns:r="http://schemas.openxmlformats.org/officeDocument/2006/relationships" xmlns:m="http://schemas.openxmlformats.org/officeDocument/2006/math" xmlns:v="urn:schemas-microsoft-com:vml" xmlns:wp14="http://schemas.microsoft.com/office/word/2010/wordprocessingDrawing" xmlns:wp="http://schemas.openxmlformats.org/drawingml/2006/wordprocessingDrawing" xmlns:w10="urn:schemas-microsoft-com:office:word" xmlns:w="http://schemas.openxmlformats.org/wordprocessingml/2006/main" xmlns:w14="http://schemas.microsoft.com/office/word/2010/wordml" xmlns:w15="http://schemas.microsoft.com/office/word/2012/wordml" xmlns:w16cex="http://schemas.microsoft.com/office/word/2018/wordml/cex" xmlns:w16cid="http://schemas.microsoft.com/office/word/2016/wordml/cid" xmlns:w16="http://schemas.microsoft.com/office/word/2018/wordml" xmlns:w16du="http://schemas.microsoft.com/office/word/2023/wordml/word16du" xmlns:w16sdtdh="http://schemas.microsoft.com/office/word/2020/wordml/sdtdatahash" xmlns:w16sdtfl="http://schemas.microsoft.com/office/word/2024/wordml/sdtformatlock" xmlns:w16se="http://schemas.microsoft.com/office/word/2015/wordml/symex" xmlns:wpg="http://schemas.microsoft.com/office/word/2010/wordprocessingGroup" xmlns:wpi="http://schemas.microsoft.com/office/word/2010/wordprocessingInk" xmlns:wne="http://schemas.microsoft.com/office/word/2006/wordml" xmlns:wps="http://schemas.microsoft.com/office/word/2010/wordprocessingShape" xmlns:a="http://schemas.openxmlformats.org/drawingml/2006/main" xmlns:pic="http://schemas.openxmlformats.org/drawingml/2006/picture" xmlns:asvg="http://schemas.microsoft.com/office/drawing/2016/SVG/main" mc:Ignorable="w14 w15 w16se w16cid w16 w16cex w16sdtdh w16sdtfl w16du wp14 asvg">
   <w:body>
     <w:p>
       <w:pPr>
@@ -51,7 +51,7 @@
           <w:szCs w:val="22"/>
         </w:rPr>
         <w:drawing>
-          <wp:anchor distT="0" distB="0" distL="114300" distR="114300" simplePos="0" relativeHeight="251659264" behindDoc="0" locked="0" layoutInCell="1" allowOverlap="1" ns4:anchorId="6D4FE633" ns4:editId="2D3F3667">
+          <wp:anchor distT="0" distB="0" distL="114300" distR="114300" simplePos="0" relativeHeight="251659264" behindDoc="0" locked="0" layoutInCell="1" allowOverlap="1" wp14:anchorId="6D4FE633" wp14:editId="2D3F3667">
             <wp:simplePos x="0" y="0"/>
             <wp:positionH relativeFrom="column">
               <wp:posOffset>281696</wp:posOffset>
@@ -77,7 +77,7 @@
                     <a:blip r:embed="rId4">
                       <a:extLst>
                         <a:ext uri="{96DAC541-7B7A-43D3-8B79-37D633B846F1}">
-                          <ns8:svgBlip r:embed="rId5"/>
+                          <asvg:svgBlip r:embed="rId5"/>
                         </a:ext>
                       </a:extLst>
                     </a:blip>
@@ -97,12 +97,12 @@
                 </pic:pic>
               </a:graphicData>
             </a:graphic>
-            <ns4:sizeRelH relativeFrom="page">
-              <ns4:pctWidth>0</ns4:pctWidth>
-            </ns4:sizeRelH>
-            <ns4:sizeRelV relativeFrom="page">
-              <ns4:pctHeight>0</ns4:pctHeight>
-            </ns4:sizeRelV>
+            <wp14:sizeRelH relativeFrom="page">
+              <wp14:pctWidth>0</wp14:pctWidth>
+            </wp14:sizeRelH>
+            <wp14:sizeRelV relativeFrom="page">
+              <wp14:pctHeight>0</wp14:pctHeight>
+            </wp14:sizeRelV>
           </wp:anchor>
         </w:drawing>
       </w:r>

</xml_diff>